<commit_message>
Agregar capturas del panel de MLflow al reporte tecnico
- Incorpora 5 capturas reales del panel MLflow (Figuras 3-7) en la seccion 2.8
- Actualiza Reporte_Tecnico.docx y .pdf (9 paginas)

Co-Authored-By: Claude Opus 4.8 <noreply@anthropic.com>
</commit_message>
<xml_diff>
--- a/Reporte_Tecnico.docx
+++ b/Reporte_Tecnico.docx
@@ -1387,7 +1387,6 @@
               <w:t>Random Forest</w:t>
             </w:r>
           </w:p>
-          <w:p/>
         </w:tc>
         <w:tc>
           <w:tcPr>
@@ -1531,7 +1530,237 @@
         <w:rPr>
           <w:b w:val="0"/>
         </w:rPr>
-        <w:t>Se configuro un servidor MLflow local (sqlite:///mlflow.db, artefactos en ./mlruns) en http://127.0.0.1:5000. En el experimento 'Actividad5_Titanic' se registraron tres corridas (RegresionLogistica, RandomForest y Comparacion_estadistica) con sus parametros, metricas (test_accuracy, test_f1, test_roc_auc, cv_f1_mean, etc.) y artefactos (matrices de confusion, curva ROC y modelos serializados). Las capturas del panel se incluyen en la carpeta evidencias.</w:t>
+        <w:t>Se configuro un servidor MLflow local (sqlite:///mlflow.db, artefactos en ./mlruns) en http://127.0.0.1:5000. En el experimento 'Actividad5_Titanic' se registraron tres corridas (RegresionLogistica, RandomForest y Comparacion_estadistica) con sus parametros, metricas y artefactos (modelos serializados y figuras). A continuacion se muestran las capturas del panel.</w:t>
+      </w:r>
+    </w:p>
+    <w:p>
+      <w:r>
+        <w:drawing>
+          <wp:inline xmlns:a="http://schemas.openxmlformats.org/drawingml/2006/main" xmlns:pic="http://schemas.openxmlformats.org/drawingml/2006/picture">
+            <wp:extent cx="5669280" cy="3034054"/>
+            <wp:docPr id="59398400" name="Picture 59398400"/>
+            <wp:cNvGraphicFramePr>
+              <a:graphicFrameLocks noChangeAspect="1"/>
+            </wp:cNvGraphicFramePr>
+            <a:graphic>
+              <a:graphicData uri="http://schemas.openxmlformats.org/drawingml/2006/picture">
+                <pic:pic>
+                  <pic:nvPicPr>
+                    <pic:cNvPr id="0" name="Screenshot 2026-06-28 131817.png"/>
+                    <pic:cNvPicPr/>
+                  </pic:nvPicPr>
+                  <pic:blipFill>
+                    <a:blip r:embed="rId14"/>
+                    <a:stretch>
+                      <a:fillRect/>
+                    </a:stretch>
+                  </pic:blipFill>
+                  <pic:spPr>
+                    <a:xfrm>
+                      <a:off x="0" y="0"/>
+                      <a:ext cx="5669280" cy="3034054"/>
+                    </a:xfrm>
+                    <a:prstGeom prst="rect"/>
+                  </pic:spPr>
+                </pic:pic>
+              </a:graphicData>
+            </a:graphic>
+          </wp:inline>
+        </w:drawing>
+      </w:r>
+    </w:p>
+    <w:p>
+      <w:r>
+        <w:rPr>
+          <w:b w:val="0"/>
+          <w:i/>
+          <w:sz w:val="18"/>
+        </w:rPr>
+        <w:t>Figura 3. Panel principal de MLflow con el experimento 'Actividad5_Titanic' registrado.</w:t>
+      </w:r>
+    </w:p>
+    <w:p>
+      <w:r>
+        <w:drawing>
+          <wp:inline xmlns:a="http://schemas.openxmlformats.org/drawingml/2006/main" xmlns:pic="http://schemas.openxmlformats.org/drawingml/2006/picture">
+            <wp:extent cx="5669280" cy="3039963"/>
+            <wp:docPr id="59398401" name="Picture 59398401"/>
+            <wp:cNvGraphicFramePr>
+              <a:graphicFrameLocks noChangeAspect="1"/>
+            </wp:cNvGraphicFramePr>
+            <a:graphic>
+              <a:graphicData uri="http://schemas.openxmlformats.org/drawingml/2006/picture">
+                <pic:pic>
+                  <pic:nvPicPr>
+                    <pic:cNvPr id="0" name="Screenshot 2026-06-28 131804.png"/>
+                    <pic:cNvPicPr/>
+                  </pic:nvPicPr>
+                  <pic:blipFill>
+                    <a:blip r:embed="rId15"/>
+                    <a:stretch>
+                      <a:fillRect/>
+                    </a:stretch>
+                  </pic:blipFill>
+                  <pic:spPr>
+                    <a:xfrm>
+                      <a:off x="0" y="0"/>
+                      <a:ext cx="5669280" cy="3039963"/>
+                    </a:xfrm>
+                    <a:prstGeom prst="rect"/>
+                  </pic:spPr>
+                </pic:pic>
+              </a:graphicData>
+            </a:graphic>
+          </wp:inline>
+        </w:drawing>
+      </w:r>
+    </w:p>
+    <w:p>
+      <w:r>
+        <w:rPr>
+          <w:b w:val="0"/>
+          <w:i/>
+          <w:sz w:val="18"/>
+        </w:rPr>
+        <w:t>Figura 4. Listado de las 3 corridas del experimento (RegresionLogistica, RandomForest, Comparacion_estadistica), todas finalizadas y con origen train.py.</w:t>
+      </w:r>
+    </w:p>
+    <w:p>
+      <w:r>
+        <w:drawing>
+          <wp:inline xmlns:a="http://schemas.openxmlformats.org/drawingml/2006/main" xmlns:pic="http://schemas.openxmlformats.org/drawingml/2006/picture">
+            <wp:extent cx="5669280" cy="3039963"/>
+            <wp:docPr id="59398402" name="Picture 59398402"/>
+            <wp:cNvGraphicFramePr>
+              <a:graphicFrameLocks noChangeAspect="1"/>
+            </wp:cNvGraphicFramePr>
+            <a:graphic>
+              <a:graphicData uri="http://schemas.openxmlformats.org/drawingml/2006/picture">
+                <pic:pic>
+                  <pic:nvPicPr>
+                    <pic:cNvPr id="0" name="Screenshot 2026-06-28 131725.png"/>
+                    <pic:cNvPicPr/>
+                  </pic:nvPicPr>
+                  <pic:blipFill>
+                    <a:blip r:embed="rId16"/>
+                    <a:stretch>
+                      <a:fillRect/>
+                    </a:stretch>
+                  </pic:blipFill>
+                  <pic:spPr>
+                    <a:xfrm>
+                      <a:off x="0" y="0"/>
+                      <a:ext cx="5669280" cy="3039963"/>
+                    </a:xfrm>
+                    <a:prstGeom prst="rect"/>
+                  </pic:spPr>
+                </pic:pic>
+              </a:graphicData>
+            </a:graphic>
+          </wp:inline>
+        </w:drawing>
+      </w:r>
+    </w:p>
+    <w:p>
+      <w:r>
+        <w:rPr>
+          <w:b w:val="0"/>
+          <w:i/>
+          <w:sz w:val="18"/>
+        </w:rPr>
+        <w:t>Figura 5. Detalle de la corrida RandomForest: 7 metricas registradas (test_accuracy, test_f1, test_roc_auc, cv_f1_mean, etc.) y 4 parametros (hiperparametros optimos).</w:t>
+      </w:r>
+    </w:p>
+    <w:p>
+      <w:r>
+        <w:drawing>
+          <wp:inline xmlns:a="http://schemas.openxmlformats.org/drawingml/2006/main" xmlns:pic="http://schemas.openxmlformats.org/drawingml/2006/picture">
+            <wp:extent cx="5669280" cy="3054735"/>
+            <wp:docPr id="59398403" name="Picture 59398403"/>
+            <wp:cNvGraphicFramePr>
+              <a:graphicFrameLocks noChangeAspect="1"/>
+            </wp:cNvGraphicFramePr>
+            <a:graphic>
+              <a:graphicData uri="http://schemas.openxmlformats.org/drawingml/2006/picture">
+                <pic:pic>
+                  <pic:nvPicPr>
+                    <pic:cNvPr id="0" name="Screenshot 2026-06-28 131746.png"/>
+                    <pic:cNvPicPr/>
+                  </pic:nvPicPr>
+                  <pic:blipFill>
+                    <a:blip r:embed="rId17"/>
+                    <a:stretch>
+                      <a:fillRect/>
+                    </a:stretch>
+                  </pic:blipFill>
+                  <pic:spPr>
+                    <a:xfrm>
+                      <a:off x="0" y="0"/>
+                      <a:ext cx="5669280" cy="3054735"/>
+                    </a:xfrm>
+                    <a:prstGeom prst="rect"/>
+                  </pic:spPr>
+                </pic:pic>
+              </a:graphicData>
+            </a:graphic>
+          </wp:inline>
+        </w:drawing>
+      </w:r>
+    </w:p>
+    <w:p>
+      <w:r>
+        <w:rPr>
+          <w:b w:val="0"/>
+          <w:i/>
+          <w:sz w:val="18"/>
+        </w:rPr>
+        <w:t>Figura 6. Graficas de metricas de la corrida RegresionLogistica en el panel de MLflow.</w:t>
+      </w:r>
+    </w:p>
+    <w:p>
+      <w:r>
+        <w:drawing>
+          <wp:inline xmlns:a="http://schemas.openxmlformats.org/drawingml/2006/main" xmlns:pic="http://schemas.openxmlformats.org/drawingml/2006/picture">
+            <wp:extent cx="5669280" cy="2886340"/>
+            <wp:docPr id="59398404" name="Picture 59398404"/>
+            <wp:cNvGraphicFramePr>
+              <a:graphicFrameLocks noChangeAspect="1"/>
+            </wp:cNvGraphicFramePr>
+            <a:graphic>
+              <a:graphicData uri="http://schemas.openxmlformats.org/drawingml/2006/picture">
+                <pic:pic>
+                  <pic:nvPicPr>
+                    <pic:cNvPr id="0" name="Screenshot 2026-06-28 131655.png"/>
+                    <pic:cNvPicPr/>
+                  </pic:nvPicPr>
+                  <pic:blipFill>
+                    <a:blip r:embed="rId18"/>
+                    <a:stretch>
+                      <a:fillRect/>
+                    </a:stretch>
+                  </pic:blipFill>
+                  <pic:spPr>
+                    <a:xfrm>
+                      <a:off x="0" y="0"/>
+                      <a:ext cx="5669280" cy="2886340"/>
+                    </a:xfrm>
+                    <a:prstGeom prst="rect"/>
+                  </pic:spPr>
+                </pic:pic>
+              </a:graphicData>
+            </a:graphic>
+          </wp:inline>
+        </w:drawing>
+      </w:r>
+    </w:p>
+    <w:p>
+      <w:r>
+        <w:rPr>
+          <w:b w:val="0"/>
+          <w:i/>
+          <w:sz w:val="18"/>
+        </w:rPr>
+        <w:t>Figura 7. Corrida Comparacion_estadistica: valores p de la prueba t (0.07) y de Wilcoxon (0.13) registrados como metricas.</w:t>
       </w:r>
     </w:p>
     <w:p>

</xml_diff>